<commit_message>
Reorganize app documentation under custom section headings
</commit_message>
<xml_diff>
--- a/OwnIt_Uganda_App_Documentation.docx
+++ b/OwnIt_Uganda_App_Documentation.docx
@@ -99,7 +99,7 @@
         </w:rPr>
         <w:t xml:space="preserve">Prepared for: SINDROM66
 Date: June 2026
-Version: 1.0.0</w:t>
+Version: 1.0.1</w:t>
       </w:r>
     </w:p>
     <w:p>
@@ -139,11 +139,20 @@
     </w:p>
     <w:p>
       <w:pPr>
-        <w:pStyle w:val="Heading2"/>
-        <w:spacing w:after="200" w:before="400"/>
-      </w:pPr>
-      <w:r>
-        <w:t xml:space="preserve">1. Welcome &amp; Onboarding Screen</w:t>
+        <w:pStyle w:val="Heading1"/>
+        <w:spacing w:after="300" w:before="500"/>
+      </w:pPr>
+      <w:r>
+        <w:t xml:space="preserve">1. Frictionless and Compliant Onboarding</w:t>
+      </w:r>
+    </w:p>
+    <w:p>
+      <w:pPr>
+        <w:pStyle w:val="Heading2"/>
+        <w:spacing w:after="150" w:before="300"/>
+      </w:pPr>
+      <w:r>
+        <w:t xml:space="preserve">Welcome &amp; Onboarding Screen</w:t>
       </w:r>
     </w:p>
     <w:p>
@@ -203,10 +212,10 @@
     <w:p>
       <w:pPr>
         <w:pStyle w:val="Heading2"/>
-        <w:spacing w:after="200" w:before="400"/>
-      </w:pPr>
-      <w:r>
-        <w:t xml:space="preserve">2. Sign Up / Registration Screen</w:t>
+        <w:spacing w:after="150" w:before="300"/>
+      </w:pPr>
+      <w:r>
+        <w:t xml:space="preserve">Sign Up / Registration Screen</w:t>
       </w:r>
     </w:p>
     <w:p>
@@ -266,18 +275,18 @@
     <w:p>
       <w:pPr>
         <w:pStyle w:val="Heading2"/>
-        <w:spacing w:after="200" w:before="400"/>
-      </w:pPr>
-      <w:r>
-        <w:t xml:space="preserve">3. Sign In / Login Screen</w:t>
-      </w:r>
-    </w:p>
-    <w:p>
-      <w:pPr>
-        <w:spacing w:after="200"/>
-      </w:pPr>
-      <w:r>
-        <w:t xml:space="preserve">The Sign In Screen provides a clean authentication interface. Users select their role (Investor or Asset Lister), enter their email/phone credentials, and type their password (with a visibility toggle). It also includes links for 'Forgot password?' and switching back to the Sign Up flow.</w:t>
+        <w:spacing w:after="150" w:before="300"/>
+      </w:pPr>
+      <w:r>
+        <w:t xml:space="preserve">KYC Verification Screen (Step 1)</w:t>
+      </w:r>
+    </w:p>
+    <w:p>
+      <w:pPr>
+        <w:spacing w:after="200"/>
+      </w:pPr>
+      <w:r>
+        <w:t xml:space="preserve">To ensure regulatory compliance and build security, the app includes a 3-step digital KYC verification flow. Step 1 gathers personal details: Date of Birth, Nationality selection, Residential Address, and current Occupation. Users who wish to try out the app first can choose to 'Skip for Now'.</w:t>
       </w:r>
     </w:p>
     <w:p>
@@ -328,19 +337,28 @@
     </w:p>
     <w:p>
       <w:pPr>
-        <w:pStyle w:val="Heading2"/>
-        <w:spacing w:after="200" w:before="400"/>
-      </w:pPr>
-      <w:r>
-        <w:t xml:space="preserve">4. Forgot Password Screen</w:t>
-      </w:r>
-    </w:p>
-    <w:p>
-      <w:pPr>
-        <w:spacing w:after="200"/>
-      </w:pPr>
-      <w:r>
-        <w:t xml:space="preserve">If users forget their password, this screen enables them to enter their registered email address or phone number to receive a secure recovery code. It features form validation and a quick back button to return to the sign-in screen.</w:t>
+        <w:pStyle w:val="Heading1"/>
+        <w:spacing w:after="300" w:before="500"/>
+      </w:pPr>
+      <w:r>
+        <w:t xml:space="preserve">2. Seamless Login</w:t>
+      </w:r>
+    </w:p>
+    <w:p>
+      <w:pPr>
+        <w:pStyle w:val="Heading2"/>
+        <w:spacing w:after="150" w:before="300"/>
+      </w:pPr>
+      <w:r>
+        <w:t xml:space="preserve">Sign In / Login Screen</w:t>
+      </w:r>
+    </w:p>
+    <w:p>
+      <w:pPr>
+        <w:spacing w:after="200"/>
+      </w:pPr>
+      <w:r>
+        <w:t xml:space="preserve">The Sign In Screen provides a clean authentication interface. Users select their role (Investor or Asset Lister), enter their email/phone credentials, and type their password (with a visibility toggle). It also includes links for 'Forgot password?' and switching back to the Sign Up flow.</w:t>
       </w:r>
     </w:p>
     <w:p>
@@ -392,18 +410,18 @@
     <w:p>
       <w:pPr>
         <w:pStyle w:val="Heading2"/>
-        <w:spacing w:after="200" w:before="400"/>
-      </w:pPr>
-      <w:r>
-        <w:t xml:space="preserve">5. KYC Verification Screen (Step 1)</w:t>
-      </w:r>
-    </w:p>
-    <w:p>
-      <w:pPr>
-        <w:spacing w:after="200"/>
-      </w:pPr>
-      <w:r>
-        <w:t xml:space="preserve">To ensure regulatory compliance and build security, the app includes a 3-step digital KYC verification flow. Step 1 gathers personal details: Date of Birth, Nationality selection, Residential Address, and current Occupation. Users who wish to try out the app first can choose to 'Skip for Now'.</w:t>
+        <w:spacing w:after="150" w:before="300"/>
+      </w:pPr>
+      <w:r>
+        <w:t xml:space="preserve">Forgot Password Screen</w:t>
+      </w:r>
+    </w:p>
+    <w:p>
+      <w:pPr>
+        <w:spacing w:after="200"/>
+      </w:pPr>
+      <w:r>
+        <w:t xml:space="preserve">If users forget their password, this screen enables them to enter their registered email address or phone number to receive a secure recovery code. It features form validation and a quick back button to return to the sign-in screen.</w:t>
       </w:r>
     </w:p>
     <w:p>
@@ -454,11 +472,20 @@
     </w:p>
     <w:p>
       <w:pPr>
-        <w:pStyle w:val="Heading2"/>
-        <w:spacing w:after="200" w:before="400"/>
-      </w:pPr>
-      <w:r>
-        <w:t xml:space="preserve">6. Investor Dashboard (Discover Tab)</w:t>
+        <w:pStyle w:val="Heading1"/>
+        <w:spacing w:after="300" w:before="500"/>
+      </w:pPr>
+      <w:r>
+        <w:t xml:space="preserve">3. Browse and Filter Diversified Real Assets</w:t>
+      </w:r>
+    </w:p>
+    <w:p>
+      <w:pPr>
+        <w:pStyle w:val="Heading2"/>
+        <w:spacing w:after="150" w:before="300"/>
+      </w:pPr>
+      <w:r>
+        <w:t xml:space="preserve">Investor Dashboard (Discover Tab)</w:t>
       </w:r>
     </w:p>
     <w:p>
@@ -518,10 +545,10 @@
     <w:p>
       <w:pPr>
         <w:pStyle w:val="Heading2"/>
-        <w:spacing w:after="200" w:before="400"/>
-      </w:pPr>
-      <w:r>
-        <w:t xml:space="preserve">7. Vetted Asset Details Screen</w:t>
+        <w:spacing w:after="150" w:before="300"/>
+      </w:pPr>
+      <w:r>
+        <w:t xml:space="preserve">Vetted Asset Details Screen</w:t>
       </w:r>
     </w:p>
     <w:p>
@@ -581,18 +608,18 @@
     <w:p>
       <w:pPr>
         <w:pStyle w:val="Heading2"/>
-        <w:spacing w:after="200" w:before="400"/>
-      </w:pPr>
-      <w:r>
-        <w:t xml:space="preserve">8. Investment Flow - Step 1: Amount Selection</w:t>
-      </w:r>
-    </w:p>
-    <w:p>
-      <w:pPr>
-        <w:spacing w:after="200"/>
-      </w:pPr>
-      <w:r>
-        <w:t xml:space="preserve">When users click 'Invest', they enter a 4-step checkout flow. Step 1 features an interactive range slider allowing investors to select their desired investment amount (minimum UGX 50,000 up to 25% of the asset's total value). It calculates the exact ownership percentage and projected monthly income dynamically.</w:t>
+        <w:spacing w:after="150" w:before="300"/>
+      </w:pPr>
+      <w:r>
+        <w:t xml:space="preserve">Invest List Tab</w:t>
+      </w:r>
+    </w:p>
+    <w:p>
+      <w:pPr>
+        <w:spacing w:after="200"/>
+      </w:pPr>
+      <w:r>
+        <w:t xml:space="preserve">The Invest Tab provides a structured list of all active listings on the platform. It allows users to quickly scan and compare yields, locations, and asset classes, with direct navigation to open details and start a co-ownership transaction.</w:t>
       </w:r>
     </w:p>
     <w:p>
@@ -643,19 +670,28 @@
     </w:p>
     <w:p>
       <w:pPr>
-        <w:pStyle w:val="Heading2"/>
-        <w:spacing w:after="200" w:before="400"/>
-      </w:pPr>
-      <w:r>
-        <w:t xml:space="preserve">9. Investment Flow - Step 2: Review returns</w:t>
-      </w:r>
-    </w:p>
-    <w:p>
-      <w:pPr>
-        <w:spacing w:after="200"/>
-      </w:pPr>
-      <w:r>
-        <w:t xml:space="preserve">Step 2 presents a summary breakdown of the selected investment: the exact UGX amount, calculated ownership percentage, estimated monthly income, and annual returns. This ensures transparency before the transaction is executed.</w:t>
+        <w:pStyle w:val="Heading1"/>
+        <w:spacing w:after="300" w:before="500"/>
+      </w:pPr>
+      <w:r>
+        <w:t xml:space="preserve">4. Seamless Investment Journey</w:t>
+      </w:r>
+    </w:p>
+    <w:p>
+      <w:pPr>
+        <w:pStyle w:val="Heading2"/>
+        <w:spacing w:after="150" w:before="300"/>
+      </w:pPr>
+      <w:r>
+        <w:t xml:space="preserve">Investment Flow - Step 1: Amount Selection</w:t>
+      </w:r>
+    </w:p>
+    <w:p>
+      <w:pPr>
+        <w:spacing w:after="200"/>
+      </w:pPr>
+      <w:r>
+        <w:t xml:space="preserve">When users click 'Invest', they enter a 4-step checkout flow. Step 1 features an interactive range slider allowing investors to select their desired investment amount (minimum UGX 50,000 up to 25% of the asset's total value). It calculates the exact ownership percentage and projected monthly income dynamically.</w:t>
       </w:r>
     </w:p>
     <w:p>
@@ -707,18 +743,18 @@
     <w:p>
       <w:pPr>
         <w:pStyle w:val="Heading2"/>
-        <w:spacing w:after="200" w:before="400"/>
-      </w:pPr>
-      <w:r>
-        <w:t xml:space="preserve">10. Investment Flow - Step 3: Payment Method</w:t>
-      </w:r>
-    </w:p>
-    <w:p>
-      <w:pPr>
-        <w:spacing w:after="200"/>
-      </w:pPr>
-      <w:r>
-        <w:t xml:space="preserve">Step 3 lets users select their preferred payment provider. It supports popular local options: MTN Mobile Money, Airtel Money, Bank Transfer, and Credit/Debit Card payments. Selecting a method displays specific provider tips (e.g., account details or USSD prompt hints).</w:t>
+        <w:spacing w:after="150" w:before="300"/>
+      </w:pPr>
+      <w:r>
+        <w:t xml:space="preserve">Investment Flow - Step 2: Review Returns</w:t>
+      </w:r>
+    </w:p>
+    <w:p>
+      <w:pPr>
+        <w:spacing w:after="200"/>
+      </w:pPr>
+      <w:r>
+        <w:t xml:space="preserve">Step 2 presents a summary breakdown of the selected investment: the exact UGX amount, calculated ownership percentage, estimated monthly income, and annual returns. This ensures transparency before the transaction is executed.</w:t>
       </w:r>
     </w:p>
     <w:p>
@@ -770,18 +806,18 @@
     <w:p>
       <w:pPr>
         <w:pStyle w:val="Heading2"/>
-        <w:spacing w:after="200" w:before="400"/>
-      </w:pPr>
-      <w:r>
-        <w:t xml:space="preserve">11. Investment Flow - Step 4: Final Confirmation</w:t>
-      </w:r>
-    </w:p>
-    <w:p>
-      <w:pPr>
-        <w:spacing w:after="200"/>
-      </w:pPr>
-      <w:r>
-        <w:t xml:space="preserve">Step 4 presents the final transaction summary, displaying payment information (e.g., MTN Mobile Money number) and a prompt to confirm co-ownership terms. Capital risk disclaimers are shown clearly before the user clicks to confirm and pay.</w:t>
+        <w:spacing w:after="150" w:before="300"/>
+      </w:pPr>
+      <w:r>
+        <w:t xml:space="preserve">Investment Flow - Step 3: Payment Method</w:t>
+      </w:r>
+    </w:p>
+    <w:p>
+      <w:pPr>
+        <w:spacing w:after="200"/>
+      </w:pPr>
+      <w:r>
+        <w:t xml:space="preserve">Step 3 lets users select their preferred payment provider. It supports popular local options: MTN Mobile Money, Airtel Money, Bank Transfer, and Credit/Debit Card payments. Selecting a method displays specific provider tips (e.g., account details or USSD prompt hints).</w:t>
       </w:r>
     </w:p>
     <w:p>
@@ -833,10 +869,73 @@
     <w:p>
       <w:pPr>
         <w:pStyle w:val="Heading2"/>
-        <w:spacing w:after="200" w:before="400"/>
-      </w:pPr>
-      <w:r>
-        <w:t xml:space="preserve">12. Investment Flow - Step 5: Success &amp; Escrow Confirmation</w:t>
+        <w:spacing w:after="150" w:before="300"/>
+      </w:pPr>
+      <w:r>
+        <w:t xml:space="preserve">Investment Flow - Step 4: Final Confirmation</w:t>
+      </w:r>
+    </w:p>
+    <w:p>
+      <w:pPr>
+        <w:spacing w:after="200"/>
+      </w:pPr>
+      <w:r>
+        <w:t xml:space="preserve">Step 4 presents the final transaction summary, displaying payment information (e.g., MTN Mobile Money number) and a prompt to confirm co-ownership terms. Capital risk disclaimers are shown clearly before the user clicks to confirm and pay.</w:t>
+      </w:r>
+    </w:p>
+    <w:p>
+      <w:pPr>
+        <w:spacing w:after="400"/>
+        <w:jc w:val="center"/>
+      </w:pPr>
+      <w:r>
+        <w:drawing>
+          <wp:inline distT="0" distB="0" distL="0" distR="0">
+            <wp:extent cx="2095500" cy="4533900"/>
+            <wp:effectExtent t="0" r="0" b="0" l="0"/>
+            <wp:docPr id="1" name="" descr="" title=""/>
+            <wp:cNvGraphicFramePr>
+              <a:graphicFrameLocks xmlns:a="http://schemas.openxmlformats.org/drawingml/2006/main" noChangeAspect="1"/>
+            </wp:cNvGraphicFramePr>
+            <a:graphic xmlns:a="http://schemas.openxmlformats.org/drawingml/2006/main">
+              <a:graphicData uri="http://schemas.openxmlformats.org/drawingml/2006/picture">
+                <pic:pic xmlns:pic="http://schemas.openxmlformats.org/drawingml/2006/picture">
+                  <pic:nvPicPr>
+                    <pic:cNvPr id="0" name="" descr=""/>
+                    <pic:cNvPicPr>
+                      <a:picLocks noChangeAspect="1" noChangeArrowheads="1"/>
+                    </pic:cNvPicPr>
+                  </pic:nvPicPr>
+                  <pic:blipFill>
+                    <a:blip r:embed="rId14" cstate="none"/>
+                    <a:srcRect/>
+                    <a:stretch>
+                      <a:fillRect/>
+                    </a:stretch>
+                  </pic:blipFill>
+                  <pic:spPr bwMode="auto">
+                    <a:xfrm>
+                      <a:off x="0" y="0"/>
+                      <a:ext cx="2095500" cy="4533900"/>
+                    </a:xfrm>
+                    <a:prstGeom prst="rect">
+                      <a:avLst/>
+                    </a:prstGeom>
+                  </pic:spPr>
+                </pic:pic>
+              </a:graphicData>
+            </a:graphic>
+          </wp:inline>
+        </w:drawing>
+      </w:r>
+    </w:p>
+    <w:p>
+      <w:pPr>
+        <w:pStyle w:val="Heading2"/>
+        <w:spacing w:after="150" w:before="300"/>
+      </w:pPr>
+      <w:r>
+        <w:t xml:space="preserve">Investment Flow - Step 5: Success &amp; Escrow Confirmation</w:t>
       </w:r>
     </w:p>
     <w:p>
@@ -895,74 +994,20 @@
     </w:p>
     <w:p>
       <w:pPr>
-        <w:pStyle w:val="Heading2"/>
-        <w:spacing w:after="200" w:before="400"/>
-      </w:pPr>
-      <w:r>
-        <w:t xml:space="preserve">13. Invest List Tab</w:t>
-      </w:r>
-    </w:p>
-    <w:p>
-      <w:pPr>
-        <w:spacing w:after="200"/>
-      </w:pPr>
-      <w:r>
-        <w:t xml:space="preserve">The Invest Tab provides a structured list of all active listings on the platform. It allows users to quickly scan and compare yields, locations, and asset classes, with direct navigation to open details and start a co-ownership transaction.</w:t>
-      </w:r>
-    </w:p>
-    <w:p>
-      <w:pPr>
-        <w:spacing w:after="400"/>
-        <w:jc w:val="center"/>
-      </w:pPr>
-      <w:r>
-        <w:drawing>
-          <wp:inline distT="0" distB="0" distL="0" distR="0">
-            <wp:extent cx="2095500" cy="4533900"/>
-            <wp:effectExtent t="0" r="0" b="0" l="0"/>
-            <wp:docPr id="1" name="" descr="" title=""/>
-            <wp:cNvGraphicFramePr>
-              <a:graphicFrameLocks xmlns:a="http://schemas.openxmlformats.org/drawingml/2006/main" noChangeAspect="1"/>
-            </wp:cNvGraphicFramePr>
-            <a:graphic xmlns:a="http://schemas.openxmlformats.org/drawingml/2006/main">
-              <a:graphicData uri="http://schemas.openxmlformats.org/drawingml/2006/picture">
-                <pic:pic xmlns:pic="http://schemas.openxmlformats.org/drawingml/2006/picture">
-                  <pic:nvPicPr>
-                    <pic:cNvPr id="0" name="" descr=""/>
-                    <pic:cNvPicPr>
-                      <a:picLocks noChangeAspect="1" noChangeArrowheads="1"/>
-                    </pic:cNvPicPr>
-                  </pic:nvPicPr>
-                  <pic:blipFill>
-                    <a:blip r:embed="rId17" cstate="none"/>
-                    <a:srcRect/>
-                    <a:stretch>
-                      <a:fillRect/>
-                    </a:stretch>
-                  </pic:blipFill>
-                  <pic:spPr bwMode="auto">
-                    <a:xfrm>
-                      <a:off x="0" y="0"/>
-                      <a:ext cx="2095500" cy="4533900"/>
-                    </a:xfrm>
-                    <a:prstGeom prst="rect">
-                      <a:avLst/>
-                    </a:prstGeom>
-                  </pic:spPr>
-                </pic:pic>
-              </a:graphicData>
-            </a:graphic>
-          </wp:inline>
-        </w:drawing>
-      </w:r>
-    </w:p>
-    <w:p>
-      <w:pPr>
-        <w:pStyle w:val="Heading2"/>
-        <w:spacing w:after="200" w:before="400"/>
-      </w:pPr>
-      <w:r>
-        <w:t xml:space="preserve">14. Portfolio Tracking Ledger</w:t>
+        <w:pStyle w:val="Heading1"/>
+        <w:spacing w:after="300" w:before="500"/>
+      </w:pPr>
+      <w:r>
+        <w:t xml:space="preserve">5. Track Portfolio Growth and Passive Yields</w:t>
+      </w:r>
+    </w:p>
+    <w:p>
+      <w:pPr>
+        <w:pStyle w:val="Heading2"/>
+        <w:spacing w:after="150" w:before="300"/>
+      </w:pPr>
+      <w:r>
+        <w:t xml:space="preserve">Portfolio Tracking Ledger</w:t>
       </w:r>
     </w:p>
     <w:p>
@@ -1022,10 +1067,10 @@
     <w:p>
       <w:pPr>
         <w:pStyle w:val="Heading2"/>
-        <w:spacing w:after="200" w:before="400"/>
-      </w:pPr>
-      <w:r>
-        <w:t xml:space="preserve">15. Smart Local Wallet Tab</w:t>
+        <w:spacing w:after="150" w:before="300"/>
+      </w:pPr>
+      <w:r>
+        <w:t xml:space="preserve">Smart Local Wallet Tab</w:t>
       </w:r>
     </w:p>
     <w:p>
@@ -1085,15 +1130,15 @@
     <w:p>
       <w:pPr>
         <w:pStyle w:val="Heading2"/>
-        <w:spacing w:after="200" w:before="400"/>
-      </w:pPr>
-      <w:r>
-        <w:t xml:space="preserve">16. Wallet Deposit Flow</w:t>
-      </w:r>
-    </w:p>
-    <w:p>
-      <w:pPr>
-        <w:spacing w:after="400"/>
+        <w:spacing w:after="150" w:before="300"/>
+      </w:pPr>
+      <w:r>
+        <w:t xml:space="preserve">Wallet Deposit Flow</w:t>
+      </w:r>
+    </w:p>
+    <w:p>
+      <w:pPr>
+        <w:spacing w:after="300"/>
       </w:pPr>
       <w:r>
         <w:t xml:space="preserve">The Deposit drawer allows users to add funds to their wallet. They specify the deposit amount (minimum UGX 10,000) and select their payment method (MTN Mobile Money, Airtel Money, or Bank Transfer) to confirm the transaction.</w:t>
@@ -1102,15 +1147,15 @@
     <w:p>
       <w:pPr>
         <w:pStyle w:val="Heading2"/>
-        <w:spacing w:after="200" w:before="400"/>
-      </w:pPr>
-      <w:r>
-        <w:t xml:space="preserve">17. Wallet Withdrawal Flow</w:t>
-      </w:r>
-    </w:p>
-    <w:p>
-      <w:pPr>
-        <w:spacing w:after="400"/>
+        <w:spacing w:after="150" w:before="300"/>
+      </w:pPr>
+      <w:r>
+        <w:t xml:space="preserve">Wallet Withdrawal Flow</w:t>
+      </w:r>
+    </w:p>
+    <w:p>
+      <w:pPr>
+        <w:spacing w:after="300"/>
       </w:pPr>
       <w:r>
         <w:t xml:space="preserve">The Withdrawal drawer enables users to withdraw earnings from their available balance. They enter the amount, select their payout destination (Mobile Money or Bank Account), and confirm to initiate an immediate transfer.</w:t>
@@ -1119,15 +1164,15 @@
     <w:p>
       <w:pPr>
         <w:pStyle w:val="Heading2"/>
-        <w:spacing w:after="200" w:before="400"/>
-      </w:pPr>
-      <w:r>
-        <w:t xml:space="preserve">18. Investor Profile Page</w:t>
-      </w:r>
-    </w:p>
-    <w:p>
-      <w:pPr>
-        <w:spacing w:after="400"/>
+        <w:spacing w:after="150" w:before="300"/>
+      </w:pPr>
+      <w:r>
+        <w:t xml:space="preserve">Investor Profile Page</w:t>
+      </w:r>
+    </w:p>
+    <w:p>
+      <w:pPr>
+        <w:spacing w:after="300"/>
       </w:pPr>
       <w:r>
         <w:t xml:space="preserve">The Profile Page shows user profile information (Name, Email, Phone, Residence) and member status details. It serves as the account management hub, allowing users to toggle configurations, view terms, or log out of the application.</w:t>
@@ -1135,11 +1180,20 @@
     </w:p>
     <w:p>
       <w:pPr>
-        <w:pStyle w:val="Heading2"/>
-        <w:spacing w:after="200" w:before="400"/>
-      </w:pPr>
-      <w:r>
-        <w:t xml:space="preserve">19. Asset Lister Overview Dashboard</w:t>
+        <w:pStyle w:val="Heading1"/>
+        <w:spacing w:after="300" w:before="500"/>
+      </w:pPr>
+      <w:r>
+        <w:t xml:space="preserve">6. Lister Overview &amp; Asset Management</w:t>
+      </w:r>
+    </w:p>
+    <w:p>
+      <w:pPr>
+        <w:pStyle w:val="Heading2"/>
+        <w:spacing w:after="150" w:before="300"/>
+      </w:pPr>
+      <w:r>
+        <w:t xml:space="preserve">Asset Lister Overview Dashboard</w:t>
       </w:r>
     </w:p>
     <w:p>
@@ -1199,15 +1253,15 @@
     <w:p>
       <w:pPr>
         <w:pStyle w:val="Heading2"/>
-        <w:spacing w:after="200" w:before="400"/>
-      </w:pPr>
-      <w:r>
-        <w:t xml:space="preserve">20. Lister Assets Ledger</w:t>
-      </w:r>
-    </w:p>
-    <w:p>
-      <w:pPr>
-        <w:spacing w:after="400"/>
+        <w:spacing w:after="150" w:before="300"/>
+      </w:pPr>
+      <w:r>
+        <w:t xml:space="preserve">Lister Assets Ledger</w:t>
+      </w:r>
+    </w:p>
+    <w:p>
+      <w:pPr>
+        <w:spacing w:after="300"/>
       </w:pPr>
       <w:r>
         <w:t xml:space="preserve">The Lister Assets page lists all properties and trade lots uploaded by the current lister. It shows active fundraising status and features a prominent '+ List a New Asset' button to trigger the multi-step listing form.</w:t>
@@ -1216,15 +1270,15 @@
     <w:p>
       <w:pPr>
         <w:pStyle w:val="Heading2"/>
-        <w:spacing w:after="200" w:before="400"/>
-      </w:pPr>
-      <w:r>
-        <w:t xml:space="preserve">21. New Asset Listing Form (Step 1)</w:t>
-      </w:r>
-    </w:p>
-    <w:p>
-      <w:pPr>
-        <w:spacing w:after="400"/>
+        <w:spacing w:after="150" w:before="300"/>
+      </w:pPr>
+      <w:r>
+        <w:t xml:space="preserve">New Asset Listing Form (Step 1)</w:t>
+      </w:r>
+    </w:p>
+    <w:p>
+      <w:pPr>
+        <w:spacing w:after="300"/>
       </w:pPr>
       <w:r>
         <w:t xml:space="preserve">The New Asset Listing Form is a 4-step wizard for asset listers. Step 1 collects core project information: Asset Name, Category (Apartment, Land, Commercial, House), Location, and a detailed project description.</w:t>
@@ -1233,10 +1287,10 @@
     <w:p>
       <w:pPr>
         <w:pStyle w:val="Heading2"/>
-        <w:spacing w:after="200" w:before="400"/>
-      </w:pPr>
-      <w:r>
-        <w:t xml:space="preserve">22. Lister Co-investors Ledger</w:t>
+        <w:spacing w:after="150" w:before="300"/>
+      </w:pPr>
+      <w:r>
+        <w:t xml:space="preserve">Lister Co-investors Ledger</w:t>
       </w:r>
     </w:p>
     <w:p>
@@ -1296,10 +1350,10 @@
     <w:p>
       <w:pPr>
         <w:pStyle w:val="Heading2"/>
-        <w:spacing w:after="200" w:before="400"/>
-      </w:pPr>
-      <w:r>
-        <w:t xml:space="preserve">23. Lister Scheduled Payouts Portal</w:t>
+        <w:spacing w:after="150" w:before="300"/>
+      </w:pPr>
+      <w:r>
+        <w:t xml:space="preserve">Lister Scheduled Payouts Portal</w:t>
       </w:r>
     </w:p>
     <w:p>

</xml_diff>

<commit_message>
Add Software Artifact Verification Table to product guide docx
</commit_message>
<xml_diff>
--- a/OwnIt_Uganda_App_Documentation.docx
+++ b/OwnIt_Uganda_App_Documentation.docx
@@ -98,8 +98,8 @@
           <w:szCs w:val="18"/>
         </w:rPr>
         <w:t xml:space="preserve">Prepared for: SINDROM66
-Date: June 2026
-Version: 1.0.1</w:t>
+Date: August 2026
+Version: 1.1.0</w:t>
       </w:r>
     </w:p>
     <w:p>
@@ -140,10 +140,644 @@
     <w:p>
       <w:pPr>
         <w:pStyle w:val="Heading1"/>
+        <w:spacing w:after="200" w:before="500"/>
+      </w:pPr>
+      <w:r>
+        <w:t xml:space="preserve">2. Software Artifact Verification &amp; Chronological File Completion Breakdown (May 2026)</w:t>
+      </w:r>
+    </w:p>
+    <w:p>
+      <w:pPr>
+        <w:spacing w:after="300"/>
+      </w:pPr>
+      <w:r>
+        <w:t xml:space="preserve">To verify platform readiness and establish the original product development audit trail, the following table lists the file-system creation and last modification timestamps for the core React source components compiled in May 2026:</w:t>
+      </w:r>
+    </w:p>
+    <w:tbl>
+      <w:tblPr>
+        <w:tblW w:type="pct" w:w="100%"/>
+        <w:tblBorders>
+          <w:top w:val="single" w:color="auto" w:sz="4"/>
+          <w:left w:val="single" w:color="auto" w:sz="4"/>
+          <w:bottom w:val="single" w:color="auto" w:sz="4"/>
+          <w:right w:val="single" w:color="auto" w:sz="4"/>
+          <w:insideH w:val="single" w:color="auto" w:sz="4"/>
+          <w:insideV w:val="single" w:color="auto" w:sz="4"/>
+        </w:tblBorders>
+      </w:tblPr>
+      <w:tblGrid>
+        <w:gridCol w:w="100"/>
+        <w:gridCol w:w="100"/>
+        <w:gridCol w:w="100"/>
+      </w:tblGrid>
+      <w:tr>
+        <w:tc>
+          <w:tcPr>
+            <w:tcW w:type="pct" w:w="40%"/>
+            <w:shd w:fill="1A7A45"/>
+          </w:tcPr>
+          <w:p>
+            <w:r>
+              <w:rPr>
+                <w:rFonts w:ascii="Arial" w:cs="Arial" w:eastAsia="Arial" w:hAnsi="Arial"/>
+                <w:b/>
+                <w:bCs/>
+                <w:color w:val="FFFFFF"/>
+              </w:rPr>
+              <w:t xml:space="preserve">Component / Source File</w:t>
+            </w:r>
+          </w:p>
+        </w:tc>
+        <w:tc>
+          <w:tcPr>
+            <w:tcW w:type="pct" w:w="30%"/>
+            <w:shd w:fill="1A7A45"/>
+          </w:tcPr>
+          <w:p>
+            <w:r>
+              <w:rPr>
+                <w:rFonts w:ascii="Arial" w:cs="Arial" w:eastAsia="Arial" w:hAnsi="Arial"/>
+                <w:b/>
+                <w:bCs/>
+                <w:color w:val="FFFFFF"/>
+              </w:rPr>
+              <w:t xml:space="preserve">Creation Date</w:t>
+            </w:r>
+          </w:p>
+        </w:tc>
+        <w:tc>
+          <w:tcPr>
+            <w:tcW w:type="pct" w:w="30%"/>
+            <w:shd w:fill="1A7A45"/>
+          </w:tcPr>
+          <w:p>
+            <w:r>
+              <w:rPr>
+                <w:rFonts w:ascii="Arial" w:cs="Arial" w:eastAsia="Arial" w:hAnsi="Arial"/>
+                <w:b/>
+                <w:bCs/>
+                <w:color w:val="FFFFFF"/>
+              </w:rPr>
+              <w:t xml:space="preserve">Last Modified Date</w:t>
+            </w:r>
+          </w:p>
+        </w:tc>
+      </w:tr>
+      <w:tr>
+        <w:tc>
+          <w:p>
+            <w:r>
+              <w:rPr>
+                <w:rFonts w:ascii="Arial" w:cs="Arial" w:eastAsia="Arial" w:hAnsi="Arial"/>
+                <w:b/>
+                <w:bCs/>
+              </w:rPr>
+              <w:t xml:space="preserve">WelcomeScreen.jsx</w:t>
+            </w:r>
+          </w:p>
+        </w:tc>
+        <w:tc>
+          <w:p>
+            <w:r>
+              <w:rPr>
+                <w:rFonts w:ascii="Arial" w:cs="Arial" w:eastAsia="Arial" w:hAnsi="Arial"/>
+              </w:rPr>
+              <w:t xml:space="preserve">6/23/2026 11:16 PM</w:t>
+            </w:r>
+          </w:p>
+        </w:tc>
+        <w:tc>
+          <w:p>
+            <w:r>
+              <w:rPr>
+                <w:rFonts w:ascii="Arial" w:cs="Arial" w:eastAsia="Arial" w:hAnsi="Arial"/>
+                <w:b/>
+                <w:bCs/>
+                <w:color w:val="1A7A45"/>
+              </w:rPr>
+              <w:t xml:space="preserve">5/16/2026 12:09 AM</w:t>
+            </w:r>
+          </w:p>
+        </w:tc>
+      </w:tr>
+      <w:tr>
+        <w:tc>
+          <w:p>
+            <w:r>
+              <w:rPr>
+                <w:rFonts w:ascii="Arial" w:cs="Arial" w:eastAsia="Arial" w:hAnsi="Arial"/>
+                <w:b w:val="false"/>
+                <w:bCs w:val="false"/>
+              </w:rPr>
+              <w:t xml:space="preserve">OwnItUgandaApp.jsx</w:t>
+            </w:r>
+          </w:p>
+        </w:tc>
+        <w:tc>
+          <w:p>
+            <w:r>
+              <w:rPr>
+                <w:rFonts w:ascii="Arial" w:cs="Arial" w:eastAsia="Arial" w:hAnsi="Arial"/>
+              </w:rPr>
+              <w:t xml:space="preserve">6/23/2026 11:16 PM</w:t>
+            </w:r>
+          </w:p>
+        </w:tc>
+        <w:tc>
+          <w:p>
+            <w:r>
+              <w:rPr>
+                <w:rFonts w:ascii="Arial" w:cs="Arial" w:eastAsia="Arial" w:hAnsi="Arial"/>
+                <w:b w:val="false"/>
+                <w:bCs w:val="false"/>
+              </w:rPr>
+              <w:t xml:space="preserve">5/15/2026 11:29 PM</w:t>
+            </w:r>
+          </w:p>
+        </w:tc>
+      </w:tr>
+      <w:tr>
+        <w:tc>
+          <w:p>
+            <w:r>
+              <w:rPr>
+                <w:rFonts w:ascii="Arial" w:cs="Arial" w:eastAsia="Arial" w:hAnsi="Arial"/>
+                <w:b w:val="false"/>
+                <w:bCs w:val="false"/>
+              </w:rPr>
+              <w:t xml:space="preserve">HomeScreen.jsx</w:t>
+            </w:r>
+          </w:p>
+        </w:tc>
+        <w:tc>
+          <w:p>
+            <w:r>
+              <w:rPr>
+                <w:rFonts w:ascii="Arial" w:cs="Arial" w:eastAsia="Arial" w:hAnsi="Arial"/>
+              </w:rPr>
+              <w:t xml:space="preserve">6/23/2026 11:16 PM</w:t>
+            </w:r>
+          </w:p>
+        </w:tc>
+        <w:tc>
+          <w:p>
+            <w:r>
+              <w:rPr>
+                <w:rFonts w:ascii="Arial" w:cs="Arial" w:eastAsia="Arial" w:hAnsi="Arial"/>
+                <w:b w:val="false"/>
+                <w:bCs w:val="false"/>
+              </w:rPr>
+              <w:t xml:space="preserve">5/15/2026 11:05 PM</w:t>
+            </w:r>
+          </w:p>
+        </w:tc>
+      </w:tr>
+      <w:tr>
+        <w:tc>
+          <w:p>
+            <w:r>
+              <w:rPr>
+                <w:rFonts w:ascii="Arial" w:cs="Arial" w:eastAsia="Arial" w:hAnsi="Arial"/>
+                <w:b w:val="false"/>
+                <w:bCs w:val="false"/>
+              </w:rPr>
+              <w:t xml:space="preserve">Register.jsx</w:t>
+            </w:r>
+          </w:p>
+        </w:tc>
+        <w:tc>
+          <w:p>
+            <w:r>
+              <w:rPr>
+                <w:rFonts w:ascii="Arial" w:cs="Arial" w:eastAsia="Arial" w:hAnsi="Arial"/>
+              </w:rPr>
+              <w:t xml:space="preserve">6/23/2026 11:16 PM</w:t>
+            </w:r>
+          </w:p>
+        </w:tc>
+        <w:tc>
+          <w:p>
+            <w:r>
+              <w:rPr>
+                <w:rFonts w:ascii="Arial" w:cs="Arial" w:eastAsia="Arial" w:hAnsi="Arial"/>
+                <w:b w:val="false"/>
+                <w:bCs w:val="false"/>
+              </w:rPr>
+              <w:t xml:space="preserve">5/15/2026 10:32 PM</w:t>
+            </w:r>
+          </w:p>
+        </w:tc>
+      </w:tr>
+      <w:tr>
+        <w:tc>
+          <w:p>
+            <w:r>
+              <w:rPr>
+                <w:rFonts w:ascii="Arial" w:cs="Arial" w:eastAsia="Arial" w:hAnsi="Arial"/>
+                <w:b w:val="false"/>
+                <w:bCs w:val="false"/>
+              </w:rPr>
+              <w:t xml:space="preserve">Login.jsx</w:t>
+            </w:r>
+          </w:p>
+        </w:tc>
+        <w:tc>
+          <w:p>
+            <w:r>
+              <w:rPr>
+                <w:rFonts w:ascii="Arial" w:cs="Arial" w:eastAsia="Arial" w:hAnsi="Arial"/>
+              </w:rPr>
+              <w:t xml:space="preserve">6/23/2026 11:16 PM</w:t>
+            </w:r>
+          </w:p>
+        </w:tc>
+        <w:tc>
+          <w:p>
+            <w:r>
+              <w:rPr>
+                <w:rFonts w:ascii="Arial" w:cs="Arial" w:eastAsia="Arial" w:hAnsi="Arial"/>
+                <w:b w:val="false"/>
+                <w:bCs w:val="false"/>
+              </w:rPr>
+              <w:t xml:space="preserve">5/15/2026 10:32 PM</w:t>
+            </w:r>
+          </w:p>
+        </w:tc>
+      </w:tr>
+      <w:tr>
+        <w:tc>
+          <w:p>
+            <w:r>
+              <w:rPr>
+                <w:rFonts w:ascii="Arial" w:cs="Arial" w:eastAsia="Arial" w:hAnsi="Arial"/>
+                <w:b w:val="false"/>
+                <w:bCs w:val="false"/>
+              </w:rPr>
+              <w:t xml:space="preserve">InvestmentFlow.jsx</w:t>
+            </w:r>
+          </w:p>
+        </w:tc>
+        <w:tc>
+          <w:p>
+            <w:r>
+              <w:rPr>
+                <w:rFonts w:ascii="Arial" w:cs="Arial" w:eastAsia="Arial" w:hAnsi="Arial"/>
+              </w:rPr>
+              <w:t xml:space="preserve">6/23/2026 11:16 PM</w:t>
+            </w:r>
+          </w:p>
+        </w:tc>
+        <w:tc>
+          <w:p>
+            <w:r>
+              <w:rPr>
+                <w:rFonts w:ascii="Arial" w:cs="Arial" w:eastAsia="Arial" w:hAnsi="Arial"/>
+                <w:b w:val="false"/>
+                <w:bCs w:val="false"/>
+              </w:rPr>
+              <w:t xml:space="preserve">5/15/2026 10:31 PM</w:t>
+            </w:r>
+          </w:p>
+        </w:tc>
+      </w:tr>
+      <w:tr>
+        <w:tc>
+          <w:p>
+            <w:r>
+              <w:rPr>
+                <w:rFonts w:ascii="Arial" w:cs="Arial" w:eastAsia="Arial" w:hAnsi="Arial"/>
+                <w:b w:val="false"/>
+                <w:bCs w:val="false"/>
+              </w:rPr>
+              <w:t xml:space="preserve">PropertyListingForm.jsx</w:t>
+            </w:r>
+          </w:p>
+        </w:tc>
+        <w:tc>
+          <w:p>
+            <w:r>
+              <w:rPr>
+                <w:rFonts w:ascii="Arial" w:cs="Arial" w:eastAsia="Arial" w:hAnsi="Arial"/>
+              </w:rPr>
+              <w:t xml:space="preserve">6/23/2026 11:16 PM</w:t>
+            </w:r>
+          </w:p>
+        </w:tc>
+        <w:tc>
+          <w:p>
+            <w:r>
+              <w:rPr>
+                <w:rFonts w:ascii="Arial" w:cs="Arial" w:eastAsia="Arial" w:hAnsi="Arial"/>
+                <w:b w:val="false"/>
+                <w:bCs w:val="false"/>
+              </w:rPr>
+              <w:t xml:space="preserve">5/15/2026 10:30 PM</w:t>
+            </w:r>
+          </w:p>
+        </w:tc>
+      </w:tr>
+      <w:tr>
+        <w:tc>
+          <w:p>
+            <w:r>
+              <w:rPr>
+                <w:rFonts w:ascii="Arial" w:cs="Arial" w:eastAsia="Arial" w:hAnsi="Arial"/>
+                <w:b w:val="false"/>
+                <w:bCs w:val="false"/>
+              </w:rPr>
+              <w:t xml:space="preserve">ProfilePage.jsx</w:t>
+            </w:r>
+          </w:p>
+        </w:tc>
+        <w:tc>
+          <w:p>
+            <w:r>
+              <w:rPr>
+                <w:rFonts w:ascii="Arial" w:cs="Arial" w:eastAsia="Arial" w:hAnsi="Arial"/>
+              </w:rPr>
+              <w:t xml:space="preserve">6/23/2026 11:16 PM</w:t>
+            </w:r>
+          </w:p>
+        </w:tc>
+        <w:tc>
+          <w:p>
+            <w:r>
+              <w:rPr>
+                <w:rFonts w:ascii="Arial" w:cs="Arial" w:eastAsia="Arial" w:hAnsi="Arial"/>
+                <w:b w:val="false"/>
+                <w:bCs w:val="false"/>
+              </w:rPr>
+              <w:t xml:space="preserve">5/15/2026 10:28 PM</w:t>
+            </w:r>
+          </w:p>
+        </w:tc>
+      </w:tr>
+      <w:tr>
+        <w:tc>
+          <w:p>
+            <w:r>
+              <w:rPr>
+                <w:rFonts w:ascii="Arial" w:cs="Arial" w:eastAsia="Arial" w:hAnsi="Arial"/>
+                <w:b w:val="false"/>
+                <w:bCs w:val="false"/>
+              </w:rPr>
+              <w:t xml:space="preserve">PortfolioScreen.jsx</w:t>
+            </w:r>
+          </w:p>
+        </w:tc>
+        <w:tc>
+          <w:p>
+            <w:r>
+              <w:rPr>
+                <w:rFonts w:ascii="Arial" w:cs="Arial" w:eastAsia="Arial" w:hAnsi="Arial"/>
+              </w:rPr>
+              <w:t xml:space="preserve">6/23/2026 11:16 PM</w:t>
+            </w:r>
+          </w:p>
+        </w:tc>
+        <w:tc>
+          <w:p>
+            <w:r>
+              <w:rPr>
+                <w:rFonts w:ascii="Arial" w:cs="Arial" w:eastAsia="Arial" w:hAnsi="Arial"/>
+                <w:b w:val="false"/>
+                <w:bCs w:val="false"/>
+              </w:rPr>
+              <w:t xml:space="preserve">5/15/2026 10:28 PM</w:t>
+            </w:r>
+          </w:p>
+        </w:tc>
+      </w:tr>
+      <w:tr>
+        <w:tc>
+          <w:p>
+            <w:r>
+              <w:rPr>
+                <w:rFonts w:ascii="Arial" w:cs="Arial" w:eastAsia="Arial" w:hAnsi="Arial"/>
+                <w:b w:val="false"/>
+                <w:bCs w:val="false"/>
+              </w:rPr>
+              <w:t xml:space="preserve">PropertyDetails.jsx</w:t>
+            </w:r>
+          </w:p>
+        </w:tc>
+        <w:tc>
+          <w:p>
+            <w:r>
+              <w:rPr>
+                <w:rFonts w:ascii="Arial" w:cs="Arial" w:eastAsia="Arial" w:hAnsi="Arial"/>
+              </w:rPr>
+              <w:t xml:space="preserve">6/23/2026 11:16 PM</w:t>
+            </w:r>
+          </w:p>
+        </w:tc>
+        <w:tc>
+          <w:p>
+            <w:r>
+              <w:rPr>
+                <w:rFonts w:ascii="Arial" w:cs="Arial" w:eastAsia="Arial" w:hAnsi="Arial"/>
+                <w:b w:val="false"/>
+                <w:bCs w:val="false"/>
+              </w:rPr>
+              <w:t xml:space="preserve">5/15/2026 10:27 PM</w:t>
+            </w:r>
+          </w:p>
+        </w:tc>
+      </w:tr>
+      <w:tr>
+        <w:tc>
+          <w:p>
+            <w:r>
+              <w:rPr>
+                <w:rFonts w:ascii="Arial" w:cs="Arial" w:eastAsia="Arial" w:hAnsi="Arial"/>
+                <w:b w:val="false"/>
+                <w:bCs w:val="false"/>
+              </w:rPr>
+              <w:t xml:space="preserve">WalletScreen.jsx</w:t>
+            </w:r>
+          </w:p>
+        </w:tc>
+        <w:tc>
+          <w:p>
+            <w:r>
+              <w:rPr>
+                <w:rFonts w:ascii="Arial" w:cs="Arial" w:eastAsia="Arial" w:hAnsi="Arial"/>
+              </w:rPr>
+              <w:t xml:space="preserve">6/23/2026 11:16 PM</w:t>
+            </w:r>
+          </w:p>
+        </w:tc>
+        <w:tc>
+          <w:p>
+            <w:r>
+              <w:rPr>
+                <w:rFonts w:ascii="Arial" w:cs="Arial" w:eastAsia="Arial" w:hAnsi="Arial"/>
+                <w:b w:val="false"/>
+                <w:bCs w:val="false"/>
+              </w:rPr>
+              <w:t xml:space="preserve">5/15/2026 7:47 PM</w:t>
+            </w:r>
+          </w:p>
+        </w:tc>
+      </w:tr>
+      <w:tr>
+        <w:tc>
+          <w:p>
+            <w:r>
+              <w:rPr>
+                <w:rFonts w:ascii="Arial" w:cs="Arial" w:eastAsia="Arial" w:hAnsi="Arial"/>
+                <w:b w:val="false"/>
+                <w:bCs w:val="false"/>
+              </w:rPr>
+              <w:t xml:space="preserve">ForgotPassword.jsx</w:t>
+            </w:r>
+          </w:p>
+        </w:tc>
+        <w:tc>
+          <w:p>
+            <w:r>
+              <w:rPr>
+                <w:rFonts w:ascii="Arial" w:cs="Arial" w:eastAsia="Arial" w:hAnsi="Arial"/>
+              </w:rPr>
+              <w:t xml:space="preserve">6/23/2026 11:16 PM</w:t>
+            </w:r>
+          </w:p>
+        </w:tc>
+        <w:tc>
+          <w:p>
+            <w:r>
+              <w:rPr>
+                <w:rFonts w:ascii="Arial" w:cs="Arial" w:eastAsia="Arial" w:hAnsi="Arial"/>
+                <w:b w:val="false"/>
+                <w:bCs w:val="false"/>
+              </w:rPr>
+              <w:t xml:space="preserve">5/15/2026 7:46 PM</w:t>
+            </w:r>
+          </w:p>
+        </w:tc>
+      </w:tr>
+      <w:tr>
+        <w:tc>
+          <w:p>
+            <w:r>
+              <w:rPr>
+                <w:rFonts w:ascii="Arial" w:cs="Arial" w:eastAsia="Arial" w:hAnsi="Arial"/>
+                <w:b w:val="false"/>
+                <w:bCs w:val="false"/>
+              </w:rPr>
+              <w:t xml:space="preserve">App.jsx</w:t>
+            </w:r>
+          </w:p>
+        </w:tc>
+        <w:tc>
+          <w:p>
+            <w:r>
+              <w:rPr>
+                <w:rFonts w:ascii="Arial" w:cs="Arial" w:eastAsia="Arial" w:hAnsi="Arial"/>
+              </w:rPr>
+              <w:t xml:space="preserve">6/23/2026 11:16 PM</w:t>
+            </w:r>
+          </w:p>
+        </w:tc>
+        <w:tc>
+          <w:p>
+            <w:r>
+              <w:rPr>
+                <w:rFonts w:ascii="Arial" w:cs="Arial" w:eastAsia="Arial" w:hAnsi="Arial"/>
+                <w:b w:val="false"/>
+                <w:bCs w:val="false"/>
+              </w:rPr>
+              <w:t xml:space="preserve">5/14/2026 4:52 PM</w:t>
+            </w:r>
+          </w:p>
+        </w:tc>
+      </w:tr>
+      <w:tr>
+        <w:tc>
+          <w:p>
+            <w:r>
+              <w:rPr>
+                <w:rFonts w:ascii="Arial" w:cs="Arial" w:eastAsia="Arial" w:hAnsi="Arial"/>
+                <w:b w:val="false"/>
+                <w:bCs w:val="false"/>
+              </w:rPr>
+              <w:t xml:space="preserve">ownit-uganda-styles.css</w:t>
+            </w:r>
+          </w:p>
+        </w:tc>
+        <w:tc>
+          <w:p>
+            <w:r>
+              <w:rPr>
+                <w:rFonts w:ascii="Arial" w:cs="Arial" w:eastAsia="Arial" w:hAnsi="Arial"/>
+              </w:rPr>
+              <w:t xml:space="preserve">6/23/2026 11:16 PM</w:t>
+            </w:r>
+          </w:p>
+        </w:tc>
+        <w:tc>
+          <w:p>
+            <w:r>
+              <w:rPr>
+                <w:rFonts w:ascii="Arial" w:cs="Arial" w:eastAsia="Arial" w:hAnsi="Arial"/>
+                <w:b w:val="false"/>
+                <w:bCs w:val="false"/>
+              </w:rPr>
+              <w:t xml:space="preserve">5/14/2026 3:10 PM</w:t>
+            </w:r>
+          </w:p>
+        </w:tc>
+      </w:tr>
+      <w:tr>
+        <w:tc>
+          <w:p>
+            <w:r>
+              <w:rPr>
+                <w:rFonts w:ascii="Arial" w:cs="Arial" w:eastAsia="Arial" w:hAnsi="Arial"/>
+                <w:b w:val="false"/>
+                <w:bCs w:val="false"/>
+              </w:rPr>
+              <w:t xml:space="preserve">KYCFlow.jsx</w:t>
+            </w:r>
+          </w:p>
+        </w:tc>
+        <w:tc>
+          <w:p>
+            <w:r>
+              <w:rPr>
+                <w:rFonts w:ascii="Arial" w:cs="Arial" w:eastAsia="Arial" w:hAnsi="Arial"/>
+              </w:rPr>
+              <w:t xml:space="preserve">6/23/2026 11:16 PM</w:t>
+            </w:r>
+          </w:p>
+        </w:tc>
+        <w:tc>
+          <w:p>
+            <w:r>
+              <w:rPr>
+                <w:rFonts w:ascii="Arial" w:cs="Arial" w:eastAsia="Arial" w:hAnsi="Arial"/>
+                <w:b w:val="false"/>
+                <w:bCs w:val="false"/>
+              </w:rPr>
+              <w:t xml:space="preserve">5/14/2026 3:10 PM</w:t>
+            </w:r>
+          </w:p>
+        </w:tc>
+      </w:tr>
+    </w:tbl>
+    <w:p>
+      <w:pPr>
+        <w:spacing w:after="400"/>
+      </w:pPr>
+    </w:p>
+    <w:p>
+      <w:pPr>
+        <w:pStyle w:val="Heading1"/>
         <w:spacing w:after="300" w:before="500"/>
       </w:pPr>
       <w:r>
-        <w:t xml:space="preserve">1. Frictionless and Compliant Onboarding</w:t>
+        <w:t xml:space="preserve">3. Frictionless and Compliant Onboarding</w:t>
       </w:r>
     </w:p>
     <w:p>
@@ -341,7 +975,7 @@
         <w:spacing w:after="300" w:before="500"/>
       </w:pPr>
       <w:r>
-        <w:t xml:space="preserve">2. Seamless Login</w:t>
+        <w:t xml:space="preserve">4. Seamless Login</w:t>
       </w:r>
     </w:p>
     <w:p>
@@ -476,7 +1110,7 @@
         <w:spacing w:after="300" w:before="500"/>
       </w:pPr>
       <w:r>
-        <w:t xml:space="preserve">3. Browse and Filter Diversified Real Assets</w:t>
+        <w:t xml:space="preserve">5. Browse and Filter Diversified Real Assets</w:t>
       </w:r>
     </w:p>
     <w:p>
@@ -674,7 +1308,7 @@
         <w:spacing w:after="300" w:before="500"/>
       </w:pPr>
       <w:r>
-        <w:t xml:space="preserve">4. Seamless Investment Journey</w:t>
+        <w:t xml:space="preserve">6. Seamless Investment Journey</w:t>
       </w:r>
     </w:p>
     <w:p>
@@ -998,7 +1632,7 @@
         <w:spacing w:after="300" w:before="500"/>
       </w:pPr>
       <w:r>
-        <w:t xml:space="preserve">5. Track Portfolio Growth and Passive Yields</w:t>
+        <w:t xml:space="preserve">7. Track Portfolio Growth and Passive Yields</w:t>
       </w:r>
     </w:p>
     <w:p>
@@ -1184,7 +1818,7 @@
         <w:spacing w:after="300" w:before="500"/>
       </w:pPr>
       <w:r>
-        <w:t xml:space="preserve">6. Lister Overview &amp; Asset Management</w:t>
+        <w:t xml:space="preserve">8. Lister Overview &amp; Asset Management</w:t>
       </w:r>
     </w:p>
     <w:p>

</xml_diff>